<commit_message>
docs: revise submission claims, evidence and presentation
</commit_message>
<xml_diff>
--- a/submission/TA_Cup_2026/finalization/01a_参赛作品简介.docx
+++ b/submission/TA_Cup_2026/finalization/01a_参赛作品简介.docx
@@ -649,17 +649,7 @@
           <w:color w:val="000000"/>
           <w:sz w:val="22"/>
         </w:rPr>
-        <w:t>“领航云学堂”由四人学生团队开发，面向学生、家长和大学生家教，以“小书灵”AI学习助手串联需求整理、可解释匹配、预约教学与课后反馈。平台综合学科、时间、经验和费用展示推荐依据，支持教师资料展示、预约接单、西安片区地图、知识笔记与练习自测，并提供按配置启用的文字、图片辅导和练习生成接口。教师可发布四节数学示范课程、记录逐题表现，核验反馈后修订下一课，保留历史版本供家长查看。系统采用H5与微信小程序共享代码、Mock与开发API双模式，形成可运行、可复现的教育服务创业原型，体现小团队运用AI工具与模块化工作流快速完成应用验证的实践能力。</w:t>
-      </w:r>
-    </w:p>
-    <w:p>
-      <w:r>
-        <w:rPr>
-          <w:rFonts w:ascii="Noto Serif CJK SC" w:hAnsi="Noto Serif CJK SC" w:eastAsia="Noto Serif CJK SC"/>
-          <w:color w:val="000000"/>
-          <w:sz w:val="16"/>
-        </w:rPr>
-        <w:t>报名字段按已确认内容填写；正式提交时请与官网附件1模板核对。</w:t>
+        <w:t>领航云学堂面向学生家长与大学生家教，解决选师信息分散、教学记录与课后反馈脱节的问题。平台以“小书灵”为交互入口，将需求整理、可解释推荐、预约、逐题记录与课程修订连接起来。家长可核对学科、时间、经历与费用等推荐依据；教师依据课堂事实确认反馈、修订下一课，保留历史版本。作品已形成三角色流程及四节数学示范课程，兼具学习资源和西安片区辅助选择。系统采用规则约束、可选模型与人工确认协作，模型接口已实现，真实供应商效果尚未验证。四人团队通过AI辅助开发形成可运行、可复现的教育服务创业原型。</w:t>
       </w:r>
     </w:p>
     <w:sectPr>

</xml_diff>

<commit_message>
docs: add live demo link to synopsis and work introduction
</commit_message>
<xml_diff>
--- a/submission/TA_Cup_2026/finalization/01a_参赛作品简介.docx
+++ b/submission/TA_Cup_2026/finalization/01a_参赛作品简介.docx
@@ -631,6 +631,27 @@
       </w:r>
     </w:p>
     <w:p>
+      <w:r>
+        <w:rPr>
+          <w:rFonts w:ascii="Noto Serif CJK SC" w:hAnsi="Noto Serif CJK SC" w:eastAsia="Noto Serif CJK SC"/>
+          <w:color w:val="000000"/>
+          <w:sz w:val="20"/>
+        </w:rPr>
+        <w:t>在线演示：</w:t>
+      </w:r>
+      <w:hyperlink r:id="rId9">
+        <w:r>
+          <w:rPr>
+            <w:rFonts w:ascii="Noto Serif CJK SC" w:hAnsi="Noto Serif CJK SC" w:eastAsia="Noto Serif CJK SC"/>
+            <w:color w:val="000000"/>
+            <w:sz w:val="20"/>
+            <w:u w:val="single"/>
+          </w:rPr>
+          <w:t>https://yunbanxue-demo.top/</w:t>
+        </w:r>
+      </w:hyperlink>
+    </w:p>
+    <w:p>
       <w:pPr>
         <w:pStyle w:val="Heading2"/>
       </w:pPr>

</xml_diff>